<commit_message>
Changed book items to have link to CoCT Libraries
</commit_message>
<xml_diff>
--- a/files/resource-list.docx
+++ b/files/resource-list.docx
@@ -24,6 +24,13 @@
     </w:p>
     <w:sdt>
       <w:sdtPr>
+        <w:rPr>
+          <w:rFonts w:asciiTheme="minorHAnsi" w:eastAsiaTheme="minorHAnsi" w:hAnsiTheme="minorHAnsi" w:cstheme="minorBidi"/>
+          <w:color w:val="auto"/>
+          <w:sz w:val="22"/>
+          <w:szCs w:val="22"/>
+          <w:lang w:val="en-ZA"/>
+        </w:rPr>
         <w:id w:val="-2015835003"/>
         <w:docPartObj>
           <w:docPartGallery w:val="Table of Contents"/>
@@ -32,14 +39,9 @@
       </w:sdtPr>
       <w:sdtEndPr>
         <w:rPr>
-          <w:rFonts w:asciiTheme="minorHAnsi" w:eastAsiaTheme="minorHAnsi" w:hAnsiTheme="minorHAnsi" w:cstheme="minorBidi"/>
           <w:b/>
           <w:bCs/>
           <w:noProof/>
-          <w:color w:val="auto"/>
-          <w:sz w:val="22"/>
-          <w:szCs w:val="22"/>
-          <w:lang w:val="en-ZA"/>
         </w:rPr>
       </w:sdtEndPr>
       <w:sdtContent>
@@ -713,14 +715,78 @@
           <w:i/>
           <w:iCs/>
         </w:rPr>
-        <w:t>, Elitsha News</w:t>
-      </w:r>
-      <w:r>
-        <w:rPr>
-          <w:i/>
-          <w:iCs/>
-        </w:rPr>
-        <w:t xml:space="preserve"> and GroundUp News on housing, as well as a decent housing factsheet from the SAHRC and an interactive map from Ndifuna Ukwazi detailing the presence and distribution of state-owned land parcels which could be developed into affordable housing sites.</w:t>
+        <w:t xml:space="preserve">, </w:t>
+      </w:r>
+      <w:proofErr w:type="spellStart"/>
+      <w:r>
+        <w:rPr>
+          <w:i/>
+          <w:iCs/>
+        </w:rPr>
+        <w:t>Elitsha</w:t>
+      </w:r>
+      <w:proofErr w:type="spellEnd"/>
+      <w:r>
+        <w:rPr>
+          <w:i/>
+          <w:iCs/>
+        </w:rPr>
+        <w:t xml:space="preserve"> News</w:t>
+      </w:r>
+      <w:r>
+        <w:rPr>
+          <w:i/>
+          <w:iCs/>
+        </w:rPr>
+        <w:t xml:space="preserve"> and </w:t>
+      </w:r>
+      <w:proofErr w:type="spellStart"/>
+      <w:r>
+        <w:rPr>
+          <w:i/>
+          <w:iCs/>
+        </w:rPr>
+        <w:t>GroundUp</w:t>
+      </w:r>
+      <w:proofErr w:type="spellEnd"/>
+      <w:r>
+        <w:rPr>
+          <w:i/>
+          <w:iCs/>
+        </w:rPr>
+        <w:t xml:space="preserve"> News on housing, as well as a decent housing factsheet from the SAHRC and an interactive map from </w:t>
+      </w:r>
+      <w:proofErr w:type="spellStart"/>
+      <w:r>
+        <w:rPr>
+          <w:i/>
+          <w:iCs/>
+        </w:rPr>
+        <w:t>Ndifuna</w:t>
+      </w:r>
+      <w:proofErr w:type="spellEnd"/>
+      <w:r>
+        <w:rPr>
+          <w:i/>
+          <w:iCs/>
+        </w:rPr>
+        <w:t xml:space="preserve"> </w:t>
+      </w:r>
+      <w:proofErr w:type="spellStart"/>
+      <w:r>
+        <w:rPr>
+          <w:i/>
+          <w:iCs/>
+        </w:rPr>
+        <w:t>Ukwazi</w:t>
+      </w:r>
+      <w:proofErr w:type="spellEnd"/>
+      <w:r>
+        <w:rPr>
+          <w:i/>
+          <w:iCs/>
+        </w:rPr>
+        <w:t xml:space="preserve"> detailing the presence and distribution of state-owned land parcels which could be developed into affordable housing sites.</w:t>
       </w:r>
     </w:p>
     <w:p/>
@@ -736,8 +802,17 @@
           <w:i/>
           <w:iCs/>
         </w:rPr>
-        <w:t>Housing - Elitsha</w:t>
-      </w:r>
+        <w:t xml:space="preserve">Housing - </w:t>
+      </w:r>
+      <w:proofErr w:type="spellStart"/>
+      <w:r>
+        <w:rPr>
+          <w:i/>
+          <w:iCs/>
+        </w:rPr>
+        <w:t>Elitsha</w:t>
+      </w:r>
+      <w:proofErr w:type="spellEnd"/>
       <w:r>
         <w:t>. Available: https://elitshanews.org.za/category/housing/ [2025, June 2].</w:t>
       </w:r>
@@ -746,15 +821,36 @@
       <w:pPr>
         <w:ind w:left="720" w:hanging="720"/>
       </w:pPr>
-      <w:r>
-        <w:t xml:space="preserve">GroundUp News. 2025. </w:t>
-      </w:r>
-      <w:r>
-        <w:rPr>
-          <w:i/>
-          <w:iCs/>
-        </w:rPr>
-        <w:t>Topic: housing - Groundup News</w:t>
+      <w:proofErr w:type="spellStart"/>
+      <w:r>
+        <w:t>GroundUp</w:t>
+      </w:r>
+      <w:proofErr w:type="spellEnd"/>
+      <w:r>
+        <w:t xml:space="preserve"> News. 2025. </w:t>
+      </w:r>
+      <w:r>
+        <w:rPr>
+          <w:i/>
+          <w:iCs/>
+        </w:rPr>
+        <w:t xml:space="preserve">Topic: housing - </w:t>
+      </w:r>
+      <w:proofErr w:type="spellStart"/>
+      <w:r>
+        <w:rPr>
+          <w:i/>
+          <w:iCs/>
+        </w:rPr>
+        <w:t>Groundup</w:t>
+      </w:r>
+      <w:proofErr w:type="spellEnd"/>
+      <w:r>
+        <w:rPr>
+          <w:i/>
+          <w:iCs/>
+        </w:rPr>
+        <w:t xml:space="preserve"> News</w:t>
       </w:r>
       <w:r>
         <w:t>. Available: https://groundup.org.za/topic/housing/ [2025, May 30].</w:t>
@@ -764,8 +860,13 @@
       <w:pPr>
         <w:ind w:left="720" w:hanging="720"/>
       </w:pPr>
-      <w:r>
-        <w:t xml:space="preserve">Ndifuna Ukwazi. 2025. </w:t>
+      <w:proofErr w:type="spellStart"/>
+      <w:r>
+        <w:t>Ndifuna</w:t>
+      </w:r>
+      <w:proofErr w:type="spellEnd"/>
+      <w:r>
+        <w:t xml:space="preserve"> Ukwazi. 2025. </w:t>
       </w:r>
       <w:r>
         <w:rPr>
@@ -841,14 +942,50 @@
         <w:t xml:space="preserve">These books are available through various libraries in the City of Cape Town.  To check location and availability of titles visit the </w:t>
       </w:r>
       <w:hyperlink r:id="rId7" w:history="1">
+        <w:proofErr w:type="spellStart"/>
         <w:r>
           <w:rPr>
             <w:rStyle w:val="Hyperlink"/>
             <w:i/>
             <w:iCs/>
           </w:rPr>
-          <w:t>CoCT Libraries OPAC</w:t>
+          <w:t>CoCT</w:t>
         </w:r>
+        <w:proofErr w:type="spellEnd"/>
+        <w:r>
+          <w:rPr>
+            <w:rStyle w:val="Hyperlink"/>
+            <w:i/>
+            <w:iCs/>
+          </w:rPr>
+          <w:t xml:space="preserve"> Libraries </w:t>
+        </w:r>
+        <w:proofErr w:type="spellStart"/>
+        <w:r>
+          <w:rPr>
+            <w:rStyle w:val="Hyperlink"/>
+            <w:i/>
+            <w:iCs/>
+          </w:rPr>
+          <w:t>OP</w:t>
+        </w:r>
+        <w:r>
+          <w:rPr>
+            <w:rStyle w:val="Hyperlink"/>
+            <w:i/>
+            <w:iCs/>
+          </w:rPr>
+          <w:t>ko</w:t>
+        </w:r>
+        <w:r>
+          <w:rPr>
+            <w:rStyle w:val="Hyperlink"/>
+            <w:i/>
+            <w:iCs/>
+          </w:rPr>
+          <w:t>AC</w:t>
+        </w:r>
+        <w:proofErr w:type="spellEnd"/>
       </w:hyperlink>
       <w:r>
         <w:rPr>
@@ -871,7 +1008,23 @@
           <w:i/>
           <w:iCs/>
         </w:rPr>
-        <w:t>Living politics in South Africa's urban shacklands.</w:t>
+        <w:t xml:space="preserve">Living politics in South Africa's urban </w:t>
+      </w:r>
+      <w:proofErr w:type="spellStart"/>
+      <w:r>
+        <w:rPr>
+          <w:i/>
+          <w:iCs/>
+        </w:rPr>
+        <w:t>shacklands</w:t>
+      </w:r>
+      <w:proofErr w:type="spellEnd"/>
+      <w:r>
+        <w:rPr>
+          <w:i/>
+          <w:iCs/>
+        </w:rPr>
+        <w:t>.</w:t>
       </w:r>
       <w:r>
         <w:t xml:space="preserve"> Chicago: The University of Chicago Press.</w:t>
@@ -917,26 +1070,60 @@
       <w:pPr>
         <w:ind w:left="720" w:hanging="720"/>
       </w:pPr>
-      <w:r>
-        <w:t xml:space="preserve">Jubelin, B. &amp; Sacks, J. 2011. </w:t>
-      </w:r>
-      <w:r>
-        <w:rPr>
-          <w:i/>
-          <w:iCs/>
-        </w:rPr>
-        <w:t>No land! No house! No vote!: voices from Symphony Way.</w:t>
-      </w:r>
-      <w:r>
-        <w:t xml:space="preserve"> Cape Town: Pambazuka Press.</w:t>
-      </w:r>
-    </w:p>
-    <w:p>
-      <w:pPr>
-        <w:ind w:left="720" w:hanging="720"/>
-      </w:pPr>
-      <w:r>
-        <w:t xml:space="preserve">Makhulu, A.-M. 2015. </w:t>
+      <w:proofErr w:type="spellStart"/>
+      <w:r>
+        <w:t>Jubelin</w:t>
+      </w:r>
+      <w:proofErr w:type="spellEnd"/>
+      <w:r>
+        <w:t xml:space="preserve">, B. &amp; Sacks, J. 2011. </w:t>
+      </w:r>
+      <w:r>
+        <w:rPr>
+          <w:i/>
+          <w:iCs/>
+        </w:rPr>
+        <w:t xml:space="preserve">No land! No house! No </w:t>
+      </w:r>
+      <w:proofErr w:type="gramStart"/>
+      <w:r>
+        <w:rPr>
+          <w:i/>
+          <w:iCs/>
+        </w:rPr>
+        <w:t>vote!:</w:t>
+      </w:r>
+      <w:proofErr w:type="gramEnd"/>
+      <w:r>
+        <w:rPr>
+          <w:i/>
+          <w:iCs/>
+        </w:rPr>
+        <w:t xml:space="preserve"> voices from Symphony Way.</w:t>
+      </w:r>
+      <w:r>
+        <w:t xml:space="preserve"> Cape Town: </w:t>
+      </w:r>
+      <w:proofErr w:type="spellStart"/>
+      <w:r>
+        <w:t>Pambazuka</w:t>
+      </w:r>
+      <w:proofErr w:type="spellEnd"/>
+      <w:r>
+        <w:t xml:space="preserve"> Press.</w:t>
+      </w:r>
+    </w:p>
+    <w:p>
+      <w:pPr>
+        <w:ind w:left="720" w:hanging="720"/>
+      </w:pPr>
+      <w:proofErr w:type="spellStart"/>
+      <w:r>
+        <w:t>Makhulu</w:t>
+      </w:r>
+      <w:proofErr w:type="spellEnd"/>
+      <w:r>
+        <w:t xml:space="preserve">, A.-M. 2015. </w:t>
       </w:r>
       <w:r>
         <w:rPr>
@@ -1003,7 +1190,23 @@
           <w:i/>
           <w:iCs/>
         </w:rPr>
-        <w:t>No place to rest: forced removals and the law in South Africa - selected papers</w:t>
+        <w:t xml:space="preserve">No place to </w:t>
+      </w:r>
+      <w:proofErr w:type="gramStart"/>
+      <w:r>
+        <w:rPr>
+          <w:i/>
+          <w:iCs/>
+        </w:rPr>
+        <w:t>rest:</w:t>
+      </w:r>
+      <w:proofErr w:type="gramEnd"/>
+      <w:r>
+        <w:rPr>
+          <w:i/>
+          <w:iCs/>
+        </w:rPr>
+        <w:t xml:space="preserve"> forced removals and the law in South Africa - selected papers</w:t>
       </w:r>
       <w:r>
         <w:t>. Cape Town: Oxford University Press</w:t>
@@ -1022,12 +1225,21 @@
       <w:r>
         <w:t xml:space="preserve">Ngwane, T. 2021. </w:t>
       </w:r>
-      <w:r>
-        <w:rPr>
-          <w:i/>
-          <w:iCs/>
-        </w:rPr>
-        <w:t>Amakomiti: grassroots democracy in South African shack settlements.</w:t>
+      <w:proofErr w:type="spellStart"/>
+      <w:r>
+        <w:rPr>
+          <w:i/>
+          <w:iCs/>
+        </w:rPr>
+        <w:t>Amakomiti</w:t>
+      </w:r>
+      <w:proofErr w:type="spellEnd"/>
+      <w:r>
+        <w:rPr>
+          <w:i/>
+          <w:iCs/>
+        </w:rPr>
+        <w:t>: grassroots democracy in South African shack settlements.</w:t>
       </w:r>
       <w:r>
         <w:t xml:space="preserve"> Auckland Park, Johannesburg: Jacana Media</w:t>
@@ -1036,15 +1248,28 @@
         <w:t xml:space="preserve">. </w:t>
       </w:r>
       <w:r>
-        <w:t>DOI:10.2307/j.ctv1g6q904.</w:t>
-      </w:r>
-    </w:p>
-    <w:p>
-      <w:pPr>
-        <w:ind w:left="720" w:hanging="720"/>
-      </w:pPr>
-      <w:r>
-        <w:t xml:space="preserve">Nomdo, C., Coetzee, E. &amp; Chanda, F.K. 2002. </w:t>
+        <w:t>DOI:10.2307/</w:t>
+      </w:r>
+      <w:proofErr w:type="gramStart"/>
+      <w:r>
+        <w:t>j.ctv</w:t>
+      </w:r>
+      <w:proofErr w:type="gramEnd"/>
+      <w:r>
+        <w:t>1g6q904.</w:t>
+      </w:r>
+    </w:p>
+    <w:p>
+      <w:pPr>
+        <w:ind w:left="720" w:hanging="720"/>
+      </w:pPr>
+      <w:proofErr w:type="spellStart"/>
+      <w:r>
+        <w:t>Nomdo</w:t>
+      </w:r>
+      <w:proofErr w:type="spellEnd"/>
+      <w:r>
+        <w:t xml:space="preserve">, C., Coetzee, E. &amp; Chanda, F.K. 2002. </w:t>
       </w:r>
       <w:r>
         <w:rPr>
@@ -1060,7 +1285,15 @@
         <w:t>Cape Town</w:t>
       </w:r>
       <w:r>
-        <w:t xml:space="preserve">: Periperi Publications. </w:t>
+        <w:t xml:space="preserve">: </w:t>
+      </w:r>
+      <w:proofErr w:type="spellStart"/>
+      <w:r>
+        <w:t>Periperi</w:t>
+      </w:r>
+      <w:proofErr w:type="spellEnd"/>
+      <w:r>
+        <w:t xml:space="preserve"> Publications. </w:t>
       </w:r>
     </w:p>
     <w:p>
@@ -1085,8 +1318,13 @@
       <w:pPr>
         <w:ind w:left="720" w:hanging="720"/>
       </w:pPr>
-      <w:r>
-        <w:t xml:space="preserve">Platzky, L. &amp; Walker, C. 1985. </w:t>
+      <w:proofErr w:type="spellStart"/>
+      <w:r>
+        <w:t>Platzky</w:t>
+      </w:r>
+      <w:proofErr w:type="spellEnd"/>
+      <w:r>
+        <w:t xml:space="preserve">, L. &amp; Walker, C. 1985. </w:t>
       </w:r>
       <w:r>
         <w:rPr>
@@ -1111,10 +1349,42 @@
           <w:i/>
           <w:iCs/>
         </w:rPr>
-        <w:t>A place to live: gender research on housing in Africa.</w:t>
-      </w:r>
-      <w:r>
-        <w:t xml:space="preserve"> Uppsala: Nordiska Afrikainstitutet.</w:t>
+        <w:t xml:space="preserve">A place to </w:t>
+      </w:r>
+      <w:proofErr w:type="gramStart"/>
+      <w:r>
+        <w:rPr>
+          <w:i/>
+          <w:iCs/>
+        </w:rPr>
+        <w:t>live:</w:t>
+      </w:r>
+      <w:proofErr w:type="gramEnd"/>
+      <w:r>
+        <w:rPr>
+          <w:i/>
+          <w:iCs/>
+        </w:rPr>
+        <w:t xml:space="preserve"> gender research on housing in Africa.</w:t>
+      </w:r>
+      <w:r>
+        <w:t xml:space="preserve"> Uppsala: </w:t>
+      </w:r>
+      <w:proofErr w:type="spellStart"/>
+      <w:r>
+        <w:t>Nordiska</w:t>
+      </w:r>
+      <w:proofErr w:type="spellEnd"/>
+      <w:r>
+        <w:t xml:space="preserve"> </w:t>
+      </w:r>
+      <w:proofErr w:type="spellStart"/>
+      <w:r>
+        <w:t>Afrikainstitutet</w:t>
+      </w:r>
+      <w:proofErr w:type="spellEnd"/>
+      <w:r>
+        <w:t>.</w:t>
       </w:r>
     </w:p>
     <w:p>
@@ -1139,8 +1409,13 @@
       <w:pPr>
         <w:ind w:left="720" w:hanging="720"/>
       </w:pPr>
-      <w:r>
-        <w:t xml:space="preserve">Unterhalter, E. 1987. </w:t>
+      <w:proofErr w:type="spellStart"/>
+      <w:r>
+        <w:t>Unterhalter</w:t>
+      </w:r>
+      <w:proofErr w:type="spellEnd"/>
+      <w:r>
+        <w:t xml:space="preserve">, E. 1987. </w:t>
       </w:r>
       <w:r>
         <w:rPr>
@@ -1219,7 +1494,23 @@
           <w:i/>
           <w:iCs/>
         </w:rPr>
-        <w:t>, found using the NexisUni database</w:t>
+        <w:t xml:space="preserve">, found using the </w:t>
+      </w:r>
+      <w:proofErr w:type="spellStart"/>
+      <w:r>
+        <w:rPr>
+          <w:i/>
+          <w:iCs/>
+        </w:rPr>
+        <w:t>NexisUni</w:t>
+      </w:r>
+      <w:proofErr w:type="spellEnd"/>
+      <w:r>
+        <w:rPr>
+          <w:i/>
+          <w:iCs/>
+        </w:rPr>
+        <w:t xml:space="preserve"> database</w:t>
       </w:r>
       <w:r>
         <w:rPr>
@@ -1235,7 +1526,15 @@
         <w:ind w:left="720" w:hanging="720"/>
       </w:pPr>
       <w:r>
-        <w:t xml:space="preserve">Banda, M. 2025. Right to housing: City of Cape Town leaves Bromwell Street residents in limbo after landmark ConCourt ruling. </w:t>
+        <w:t xml:space="preserve">Banda, M. 2025. Right to housing: City of Cape Town leaves Bromwell Street residents in limbo after landmark </w:t>
+      </w:r>
+      <w:proofErr w:type="spellStart"/>
+      <w:r>
+        <w:t>ConCourt</w:t>
+      </w:r>
+      <w:proofErr w:type="spellEnd"/>
+      <w:r>
+        <w:t xml:space="preserve"> ruling. </w:t>
       </w:r>
       <w:r>
         <w:rPr>
@@ -1309,6 +1608,7 @@
       <w:r>
         <w:t xml:space="preserve">Damons, M. 2024. Activists want 12 more pieces of public land used for housing. </w:t>
       </w:r>
+      <w:proofErr w:type="spellStart"/>
       <w:r>
         <w:rPr>
           <w:i/>
@@ -1316,6 +1616,7 @@
         </w:rPr>
         <w:t>GroundUp</w:t>
       </w:r>
+      <w:proofErr w:type="spellEnd"/>
       <w:r>
         <w:t>. May 9</w:t>
       </w:r>
@@ -1330,9 +1631,15 @@
       <w:pPr>
         <w:ind w:left="720" w:hanging="720"/>
       </w:pPr>
-      <w:r>
-        <w:t xml:space="preserve">Gontsana, M.-A. 2023. Cape Town City Centre tenants in tears as Municipality auctions their homes. </w:t>
-      </w:r>
+      <w:proofErr w:type="spellStart"/>
+      <w:r>
+        <w:t>Gontsana</w:t>
+      </w:r>
+      <w:proofErr w:type="spellEnd"/>
+      <w:r>
+        <w:t xml:space="preserve">, M.-A. 2023. Cape Town City Centre tenants in tears as Municipality auctions their homes. </w:t>
+      </w:r>
+      <w:proofErr w:type="spellStart"/>
       <w:r>
         <w:rPr>
           <w:i/>
@@ -1340,6 +1647,7 @@
         </w:rPr>
         <w:t>GroundUp</w:t>
       </w:r>
+      <w:proofErr w:type="spellEnd"/>
       <w:r>
         <w:t>. November 6</w:t>
       </w:r>
@@ -1355,8 +1663,17 @@
         <w:ind w:left="720" w:hanging="720"/>
       </w:pPr>
       <w:r>
-        <w:t xml:space="preserve">Hendricks, A. 2018. Shack Erected At Helen Zille's Residence. </w:t>
-      </w:r>
+        <w:t xml:space="preserve">Hendricks, A. 2018. Shack Erected </w:t>
+      </w:r>
+      <w:proofErr w:type="gramStart"/>
+      <w:r>
+        <w:t>At</w:t>
+      </w:r>
+      <w:proofErr w:type="gramEnd"/>
+      <w:r>
+        <w:t xml:space="preserve"> Helen Zille's Residence. </w:t>
+      </w:r>
+      <w:proofErr w:type="spellStart"/>
       <w:r>
         <w:rPr>
           <w:i/>
@@ -1364,6 +1681,7 @@
         </w:rPr>
         <w:t>GroundUp</w:t>
       </w:r>
+      <w:proofErr w:type="spellEnd"/>
       <w:r>
         <w:t>. July 18</w:t>
       </w:r>
@@ -1381,6 +1699,7 @@
       <w:r>
         <w:t xml:space="preserve">Hendricks, A. 2024. Families fear eviction from old train yard. </w:t>
       </w:r>
+      <w:proofErr w:type="spellStart"/>
       <w:r>
         <w:rPr>
           <w:i/>
@@ -1388,6 +1707,7 @@
         </w:rPr>
         <w:t>GroundUp</w:t>
       </w:r>
+      <w:proofErr w:type="spellEnd"/>
       <w:r>
         <w:t>. May 28</w:t>
       </w:r>
@@ -1426,9 +1746,14 @@
       <w:pPr>
         <w:ind w:left="720" w:hanging="720"/>
       </w:pPr>
+      <w:proofErr w:type="spellStart"/>
       <w:r>
         <w:lastRenderedPageBreak/>
-        <w:t xml:space="preserve">Matlawe, K. 2019. Housing crisis inextricably entwined with land occupations. </w:t>
+        <w:t>Matlawe</w:t>
+      </w:r>
+      <w:proofErr w:type="spellEnd"/>
+      <w:r>
+        <w:t xml:space="preserve">, K. 2019. Housing crisis inextricably entwined with land occupations. </w:t>
       </w:r>
       <w:r>
         <w:rPr>
@@ -1451,8 +1776,13 @@
       <w:pPr>
         <w:ind w:left="720" w:hanging="720"/>
       </w:pPr>
-      <w:r>
-        <w:t>Metelerkamp, T. 2024. Explainer: Tracking social housing and how it works in the City of Cape Town</w:t>
+      <w:proofErr w:type="spellStart"/>
+      <w:r>
+        <w:t>Metelerkamp</w:t>
+      </w:r>
+      <w:proofErr w:type="spellEnd"/>
+      <w:r>
+        <w:t>, T. 2024. Explainer: Tracking social housing and how it works in the City of Cape Town</w:t>
       </w:r>
       <w:r>
         <w:t>.</w:t>
@@ -1481,8 +1811,29 @@
       <w:pPr>
         <w:ind w:left="720" w:hanging="720"/>
       </w:pPr>
-      <w:r>
-        <w:t xml:space="preserve">Metelerkamp, T. 2025. Crucial decision: Cape Town's Tafelberg case goes to ConCourt - activists call for coordinated affordable housing plan. </w:t>
+      <w:proofErr w:type="spellStart"/>
+      <w:r>
+        <w:t>Metelerkamp</w:t>
+      </w:r>
+      <w:proofErr w:type="spellEnd"/>
+      <w:r>
+        <w:t xml:space="preserve">, T. 2025. Crucial decision: Cape Town's </w:t>
+      </w:r>
+      <w:proofErr w:type="spellStart"/>
+      <w:r>
+        <w:t>Tafelberg</w:t>
+      </w:r>
+      <w:proofErr w:type="spellEnd"/>
+      <w:r>
+        <w:t xml:space="preserve"> case goes to </w:t>
+      </w:r>
+      <w:proofErr w:type="spellStart"/>
+      <w:r>
+        <w:t>ConCourt</w:t>
+      </w:r>
+      <w:proofErr w:type="spellEnd"/>
+      <w:r>
+        <w:t xml:space="preserve"> - activists call for coordinated affordable housing plan. </w:t>
       </w:r>
       <w:r>
         <w:rPr>
@@ -1498,15 +1849,36 @@
         <w:t>.</w:t>
       </w:r>
       <w:r>
-        <w:t xml:space="preserve"> Available: NexisUni [2025, June 1].</w:t>
-      </w:r>
-    </w:p>
-    <w:p>
-      <w:pPr>
-        <w:ind w:left="720" w:hanging="720"/>
-      </w:pPr>
-      <w:r>
-        <w:t xml:space="preserve">Mthombothi, B. 2025. So you really want to talk about land expropriation? </w:t>
+        <w:t xml:space="preserve"> Available: </w:t>
+      </w:r>
+      <w:proofErr w:type="spellStart"/>
+      <w:r>
+        <w:t>NexisUni</w:t>
+      </w:r>
+      <w:proofErr w:type="spellEnd"/>
+      <w:r>
+        <w:t xml:space="preserve"> [2025, June 1].</w:t>
+      </w:r>
+    </w:p>
+    <w:p>
+      <w:pPr>
+        <w:ind w:left="720" w:hanging="720"/>
+      </w:pPr>
+      <w:proofErr w:type="spellStart"/>
+      <w:r>
+        <w:t>Mthombothi</w:t>
+      </w:r>
+      <w:proofErr w:type="spellEnd"/>
+      <w:r>
+        <w:t xml:space="preserve">, B. 2025. </w:t>
+      </w:r>
+      <w:proofErr w:type="gramStart"/>
+      <w:r>
+        <w:t>So</w:t>
+      </w:r>
+      <w:proofErr w:type="gramEnd"/>
+      <w:r>
+        <w:t xml:space="preserve"> you really want to talk about land expropriation? </w:t>
       </w:r>
       <w:r>
         <w:rPr>
@@ -1530,7 +1902,23 @@
         <w:ind w:left="720" w:hanging="720"/>
       </w:pPr>
       <w:r>
-        <w:t xml:space="preserve">Mwangi, N. 2024. Abahlali Basemjondolo condemns forced evictions in South Africa. </w:t>
+        <w:t xml:space="preserve">Mwangi, N. 2024. </w:t>
+      </w:r>
+      <w:proofErr w:type="spellStart"/>
+      <w:r>
+        <w:t>Abahlali</w:t>
+      </w:r>
+      <w:proofErr w:type="spellEnd"/>
+      <w:r>
+        <w:t xml:space="preserve"> </w:t>
+      </w:r>
+      <w:proofErr w:type="spellStart"/>
+      <w:r>
+        <w:t>Basemjondolo</w:t>
+      </w:r>
+      <w:proofErr w:type="spellEnd"/>
+      <w:r>
+        <w:t xml:space="preserve"> condemns forced evictions in South Africa. </w:t>
       </w:r>
       <w:r>
         <w:rPr>
@@ -1553,8 +1941,13 @@
       <w:pPr>
         <w:ind w:left="720" w:hanging="720"/>
       </w:pPr>
-      <w:r>
-        <w:t xml:space="preserve">Ntlemeza, A. 2023. Youth mobilisation needed to forge inclusive future. </w:t>
+      <w:proofErr w:type="spellStart"/>
+      <w:r>
+        <w:t>Ntlemeza</w:t>
+      </w:r>
+      <w:proofErr w:type="spellEnd"/>
+      <w:r>
+        <w:t xml:space="preserve">, A. 2023. Youth mobilisation needed to forge inclusive future. </w:t>
       </w:r>
       <w:r>
         <w:rPr>
@@ -1578,7 +1971,15 @@
         <w:ind w:left="720" w:hanging="720"/>
       </w:pPr>
       <w:r>
-        <w:t xml:space="preserve">Payne, S. 2024. Dispossession commemoration : Pillowcases and stones - heartache of brutal District Six forced removals still lingers. </w:t>
+        <w:t xml:space="preserve">Payne, S. 2024. Dispossession </w:t>
+      </w:r>
+      <w:proofErr w:type="gramStart"/>
+      <w:r>
+        <w:t>commemoration :</w:t>
+      </w:r>
+      <w:proofErr w:type="gramEnd"/>
+      <w:r>
+        <w:t xml:space="preserve"> Pillowcases and stones - heartache of brutal District Six forced removals still lingers. </w:t>
       </w:r>
       <w:r>
         <w:rPr>
@@ -1602,7 +2003,15 @@
         <w:ind w:left="720" w:hanging="720"/>
       </w:pPr>
       <w:r>
-        <w:t xml:space="preserve">Serra, G. 2024. ‘Release Tafelberg land now, Mr Premier’. </w:t>
+        <w:t xml:space="preserve">Serra, G. 2024. ‘Release </w:t>
+      </w:r>
+      <w:proofErr w:type="spellStart"/>
+      <w:r>
+        <w:t>Tafelberg</w:t>
+      </w:r>
+      <w:proofErr w:type="spellEnd"/>
+      <w:r>
+        <w:t xml:space="preserve"> land now, Mr Premier’. </w:t>
       </w:r>
       <w:r>
         <w:rPr>
@@ -1674,7 +2083,23 @@
         <w:ind w:left="720" w:hanging="720"/>
       </w:pPr>
       <w:r>
-        <w:t xml:space="preserve">Sikhakhane, N. 2024. Shift for change: Growing women leaders is the goal of land housing rights movement Abahlali baseMjondolo. </w:t>
+        <w:t xml:space="preserve">Sikhakhane, N. 2024. Shift for change: Growing women leaders is the goal of land housing rights movement </w:t>
+      </w:r>
+      <w:proofErr w:type="spellStart"/>
+      <w:r>
+        <w:t>Abahlali</w:t>
+      </w:r>
+      <w:proofErr w:type="spellEnd"/>
+      <w:r>
+        <w:t xml:space="preserve"> </w:t>
+      </w:r>
+      <w:proofErr w:type="spellStart"/>
+      <w:r>
+        <w:t>baseMjondolo</w:t>
+      </w:r>
+      <w:proofErr w:type="spellEnd"/>
+      <w:r>
+        <w:t xml:space="preserve">. </w:t>
       </w:r>
       <w:r>
         <w:rPr>
@@ -1698,7 +2123,15 @@
         <w:ind w:left="720" w:hanging="720"/>
       </w:pPr>
       <w:r>
-        <w:t xml:space="preserve">Vuso, S. 2022. Cape Flats women protest against poverty, patriarchy. </w:t>
+        <w:t xml:space="preserve">Vuso, S. 2022. Cape Flats women </w:t>
+      </w:r>
+      <w:proofErr w:type="gramStart"/>
+      <w:r>
+        <w:t>protest against</w:t>
+      </w:r>
+      <w:proofErr w:type="gramEnd"/>
+      <w:r>
+        <w:t xml:space="preserve"> poverty, patriarchy. </w:t>
       </w:r>
       <w:r>
         <w:rPr>
@@ -1826,7 +2259,23 @@
           <w:i/>
           <w:iCs/>
         </w:rPr>
-        <w:t xml:space="preserve"> For example, one can access S Ismail’s 2015 piece on the Victoria Mxenge Housing </w:t>
+        <w:t xml:space="preserve"> For example, one can access S Ismail’s 2015 piece on the Victoria </w:t>
+      </w:r>
+      <w:proofErr w:type="spellStart"/>
+      <w:r>
+        <w:rPr>
+          <w:i/>
+          <w:iCs/>
+        </w:rPr>
+        <w:t>Mxenge</w:t>
+      </w:r>
+      <w:proofErr w:type="spellEnd"/>
+      <w:r>
+        <w:rPr>
+          <w:i/>
+          <w:iCs/>
+        </w:rPr>
+        <w:t xml:space="preserve"> Housing </w:t>
       </w:r>
       <w:r>
         <w:rPr>
@@ -1890,7 +2339,23 @@
           <w:i/>
           <w:iCs/>
         </w:rPr>
-        <w:t xml:space="preserve"> SciHub and Anna’s Archive by searching the DOI, but for legal reasons please do not do this </w:t>
+        <w:t xml:space="preserve"> </w:t>
+      </w:r>
+      <w:proofErr w:type="spellStart"/>
+      <w:r>
+        <w:rPr>
+          <w:i/>
+          <w:iCs/>
+        </w:rPr>
+        <w:t>SciHub</w:t>
+      </w:r>
+      <w:proofErr w:type="spellEnd"/>
+      <w:r>
+        <w:rPr>
+          <w:i/>
+          <w:iCs/>
+        </w:rPr>
+        <w:t xml:space="preserve"> and Anna’s Archive by searching the DOI, but for legal reasons please do not do this </w:t>
       </w:r>
     </w:p>
     <w:p>
@@ -1932,7 +2397,23 @@
           <w:b/>
           <w:bCs/>
         </w:rPr>
-        <w:t xml:space="preserve"> 173. DOI:10.1016/j.worlddev.2023.106415.</w:t>
+        <w:t xml:space="preserve"> 173. </w:t>
+      </w:r>
+      <w:proofErr w:type="gramStart"/>
+      <w:r>
+        <w:rPr>
+          <w:b/>
+          <w:bCs/>
+        </w:rPr>
+        <w:t>DOI:10.1016/j.worlddev</w:t>
+      </w:r>
+      <w:proofErr w:type="gramEnd"/>
+      <w:r>
+        <w:rPr>
+          <w:b/>
+          <w:bCs/>
+        </w:rPr>
+        <w:t>.2023.106415.</w:t>
       </w:r>
     </w:p>
     <w:p>
@@ -1989,7 +2470,27 @@
           <w:i/>
           <w:iCs/>
         </w:rPr>
-        <w:t>Canadian Journal of African Studies / Revue canadienne des études africaines.</w:t>
+        <w:t xml:space="preserve">Canadian Journal of African Studies / Revue canadienne des études </w:t>
+      </w:r>
+      <w:proofErr w:type="spellStart"/>
+      <w:r>
+        <w:rPr>
+          <w:b/>
+          <w:bCs/>
+          <w:i/>
+          <w:iCs/>
+        </w:rPr>
+        <w:t>africaines</w:t>
+      </w:r>
+      <w:proofErr w:type="spellEnd"/>
+      <w:r>
+        <w:rPr>
+          <w:b/>
+          <w:bCs/>
+          <w:i/>
+          <w:iCs/>
+        </w:rPr>
+        <w:t>.</w:t>
       </w:r>
       <w:r>
         <w:rPr>
@@ -2061,23 +2562,55 @@
           <w:b/>
           <w:bCs/>
         </w:rPr>
-        <w:t xml:space="preserve"> 52(3):421-435. DOI:10.1093/cdj/bsx025.</w:t>
-      </w:r>
-    </w:p>
-    <w:p>
-      <w:pPr>
-        <w:ind w:left="720" w:hanging="720"/>
-        <w:rPr>
-          <w:b/>
-          <w:bCs/>
-        </w:rPr>
-      </w:pPr>
-      <w:r>
-        <w:rPr>
-          <w:b/>
-          <w:bCs/>
-        </w:rPr>
-        <w:t xml:space="preserve">Ho, P. 2020. The credibility of (in)formality: or, the irrelevance of institutional form in judging performance. </w:t>
+        <w:t xml:space="preserve"> 52(3):421-435. DOI:10.1093/</w:t>
+      </w:r>
+      <w:proofErr w:type="spellStart"/>
+      <w:r>
+        <w:rPr>
+          <w:b/>
+          <w:bCs/>
+        </w:rPr>
+        <w:t>cdj</w:t>
+      </w:r>
+      <w:proofErr w:type="spellEnd"/>
+      <w:r>
+        <w:rPr>
+          <w:b/>
+          <w:bCs/>
+        </w:rPr>
+        <w:t>/bsx025.</w:t>
+      </w:r>
+    </w:p>
+    <w:p>
+      <w:pPr>
+        <w:ind w:left="720" w:hanging="720"/>
+        <w:rPr>
+          <w:b/>
+          <w:bCs/>
+        </w:rPr>
+      </w:pPr>
+      <w:r>
+        <w:rPr>
+          <w:b/>
+          <w:bCs/>
+        </w:rPr>
+        <w:t xml:space="preserve">Ho, P. 2020. The credibility of (in)formality: </w:t>
+      </w:r>
+      <w:proofErr w:type="gramStart"/>
+      <w:r>
+        <w:rPr>
+          <w:b/>
+          <w:bCs/>
+        </w:rPr>
+        <w:t>or,</w:t>
+      </w:r>
+      <w:proofErr w:type="gramEnd"/>
+      <w:r>
+        <w:rPr>
+          <w:b/>
+          <w:bCs/>
+        </w:rPr>
+        <w:t xml:space="preserve"> the irrelevance of institutional form in judging performance. </w:t>
       </w:r>
       <w:r>
         <w:rPr>
@@ -2093,15 +2626,39 @@
           <w:b/>
           <w:bCs/>
         </w:rPr>
-        <w:t xml:space="preserve"> 99. DOI:10.1016/j.cities.2020.102609.</w:t>
-      </w:r>
-    </w:p>
-    <w:p>
-      <w:pPr>
-        <w:ind w:left="720" w:hanging="720"/>
-      </w:pPr>
-      <w:r>
-        <w:t xml:space="preserve">Houssay-Holzschuch, M. &amp; Thébault, E. 2017. Dis-locating public space: Occupy Rondebosch Common, Cape Town. </w:t>
+        <w:t xml:space="preserve"> 99. </w:t>
+      </w:r>
+      <w:proofErr w:type="gramStart"/>
+      <w:r>
+        <w:rPr>
+          <w:b/>
+          <w:bCs/>
+        </w:rPr>
+        <w:t>DOI:10.1016/j.cities</w:t>
+      </w:r>
+      <w:proofErr w:type="gramEnd"/>
+      <w:r>
+        <w:rPr>
+          <w:b/>
+          <w:bCs/>
+        </w:rPr>
+        <w:t>.2020.102609.</w:t>
+      </w:r>
+    </w:p>
+    <w:p>
+      <w:pPr>
+        <w:ind w:left="720" w:hanging="720"/>
+      </w:pPr>
+      <w:r>
+        <w:t>Houssay-</w:t>
+      </w:r>
+      <w:proofErr w:type="spellStart"/>
+      <w:r>
+        <w:t>Holzschuch</w:t>
+      </w:r>
+      <w:proofErr w:type="spellEnd"/>
+      <w:r>
+        <w:t xml:space="preserve">, M. &amp; Thébault, E. 2017. Dis-locating public space: Occupy Rondebosch Common, Cape Town. </w:t>
       </w:r>
       <w:r>
         <w:rPr>
@@ -2155,28 +2712,34 @@
           <w:i/>
           <w:iCs/>
         </w:rPr>
-        <w:t>The Victoria Mxenge Housing Project: Women Building Communities Through Social Activism and Informal Learning</w:t>
-      </w:r>
-      <w:r>
-        <w:rPr>
-          <w:b/>
-          <w:bCs/>
-        </w:rPr>
-        <w:t>. Cape Town, South Africa: UCT Press.</w:t>
-      </w:r>
-      <w:r>
-        <w:rPr>
-          <w:b/>
-          <w:bCs/>
-        </w:rPr>
-        <w:t xml:space="preserve"> DOI:</w:t>
-      </w:r>
-      <w:r>
-        <w:rPr>
-          <w:b/>
-          <w:bCs/>
-        </w:rPr>
-        <w:t>10.58331/UCTPRESS.54</w:t>
+        <w:t xml:space="preserve">The Victoria </w:t>
+      </w:r>
+      <w:proofErr w:type="spellStart"/>
+      <w:r>
+        <w:rPr>
+          <w:b/>
+          <w:bCs/>
+          <w:i/>
+          <w:iCs/>
+        </w:rPr>
+        <w:t>Mxenge</w:t>
+      </w:r>
+      <w:proofErr w:type="spellEnd"/>
+      <w:r>
+        <w:rPr>
+          <w:b/>
+          <w:bCs/>
+          <w:i/>
+          <w:iCs/>
+        </w:rPr>
+        <w:t xml:space="preserve"> Housing Project: Women Building Communities Through Social Activism and Informal Learning</w:t>
+      </w:r>
+      <w:r>
+        <w:rPr>
+          <w:b/>
+          <w:bCs/>
+        </w:rPr>
+        <w:t>. Cape Town, South Africa: UCT Press. DOI:10.58331/UCTPRESS.54</w:t>
       </w:r>
     </w:p>
     <w:p>
@@ -2251,8 +2814,13 @@
       <w:pPr>
         <w:ind w:left="720" w:hanging="720"/>
       </w:pPr>
-      <w:r>
-        <w:t xml:space="preserve">Madlingozi, T. 2007. Post-Apartheid social movements and the quest for the elusive ‘new’ South Africa. </w:t>
+      <w:proofErr w:type="spellStart"/>
+      <w:r>
+        <w:t>Madlingozi</w:t>
+      </w:r>
+      <w:proofErr w:type="spellEnd"/>
+      <w:r>
+        <w:t xml:space="preserve">, T. 2007. Post-Apartheid social movements and the quest for the elusive ‘new’ South Africa. </w:t>
       </w:r>
       <w:r>
         <w:rPr>
@@ -2262,8 +2830,13 @@
         <w:t>Journal of Law &amp; Society.</w:t>
       </w:r>
       <w:r>
-        <w:t xml:space="preserve"> 34(1):77-98. DOI:10.1111/j.1467-6478.2007.00383.x.</w:t>
-      </w:r>
+        <w:t xml:space="preserve"> 34(1):77-98. DOI:10.1111/j.1467-6478.2007.</w:t>
+      </w:r>
+      <w:proofErr w:type="gramStart"/>
+      <w:r>
+        <w:t>00383.x.</w:t>
+      </w:r>
+      <w:proofErr w:type="gramEnd"/>
     </w:p>
     <w:p>
       <w:pPr>
@@ -2320,7 +2893,15 @@
         <w:ind w:left="720" w:hanging="720"/>
       </w:pPr>
       <w:r>
-        <w:t xml:space="preserve">Nhlabathi, S.S. 2000. The role of community based organizations in housing low-income people. </w:t>
+        <w:t xml:space="preserve">Nhlabathi, S.S. 2000. The role of </w:t>
+      </w:r>
+      <w:proofErr w:type="gramStart"/>
+      <w:r>
+        <w:t>community based</w:t>
+      </w:r>
+      <w:proofErr w:type="gramEnd"/>
+      <w:r>
+        <w:t xml:space="preserve"> organizations in housing low-income people. </w:t>
       </w:r>
       <w:r>
         <w:rPr>
@@ -2373,8 +2954,13 @@
       <w:pPr>
         <w:ind w:left="720" w:hanging="720"/>
       </w:pPr>
-      <w:r>
-        <w:t xml:space="preserve">Procupez, V.I. 2012. The work of dwelling: living together in squatter housing cooperatives in Buenos Aires, Argentina. Ph.D. Thesis. The Johns Hopkins University. Available: </w:t>
+      <w:proofErr w:type="spellStart"/>
+      <w:r>
+        <w:t>Procupez</w:t>
+      </w:r>
+      <w:proofErr w:type="spellEnd"/>
+      <w:r>
+        <w:t xml:space="preserve">, V.I. 2012. The work of dwelling: living together in squatter housing cooperatives in Buenos Aires, Argentina. Ph.D. Thesis. The Johns Hopkins University. Available: </w:t>
       </w:r>
       <w:hyperlink r:id="rId9" w:history="1">
         <w:r>
@@ -2399,12 +2985,21 @@
           <w:bCs/>
         </w:rPr>
       </w:pPr>
-      <w:r>
-        <w:rPr>
-          <w:b/>
-          <w:bCs/>
-        </w:rPr>
-        <w:t xml:space="preserve">Sinwell, L. 2008. Using Giddens's theory of 'structuration' and Freirean philosophy to understand participation in the Alexandra Renewal Project. </w:t>
+      <w:proofErr w:type="spellStart"/>
+      <w:r>
+        <w:rPr>
+          <w:b/>
+          <w:bCs/>
+        </w:rPr>
+        <w:t>Sinwell</w:t>
+      </w:r>
+      <w:proofErr w:type="spellEnd"/>
+      <w:r>
+        <w:rPr>
+          <w:b/>
+          <w:bCs/>
+        </w:rPr>
+        <w:t xml:space="preserve">, L. 2008. Using Giddens's theory of 'structuration' and Freirean philosophy to understand participation in the Alexandra Renewal Project. </w:t>
       </w:r>
       <w:r>
         <w:rPr>
@@ -2598,8 +3193,13 @@
       <w:pPr>
         <w:ind w:left="720" w:hanging="720"/>
       </w:pPr>
-      <w:r>
-        <w:t>Dwaikat-Shaer, N. 2021. Challenging spatial oppression in a context of housing rights denial: a case study in so-called Area C, West Bank, Palestine. Ph.D. Thesis. McGill University. Available: https://www.proquest.com/dissertations-theses/b-challenging-spatial-oppression-context-housing/docview/2701129927/se-2?accountid=14500.</w:t>
+      <w:proofErr w:type="spellStart"/>
+      <w:r>
+        <w:t>Dwaikat</w:t>
+      </w:r>
+      <w:proofErr w:type="spellEnd"/>
+      <w:r>
+        <w:t>-Shaer, N. 2021. Challenging spatial oppression in a context of housing rights denial: a case study in so-called Area C, West Bank, Palestine. Ph.D. Thesis. McGill University. Available: https://www.proquest.com/dissertations-theses/b-challenging-spatial-oppression-context-housing/docview/2701129927/se-2?accountid=14500.</w:t>
       </w:r>
     </w:p>
     <w:p>
@@ -2649,7 +3249,15 @@
         <w:ind w:left="720" w:hanging="720"/>
       </w:pPr>
       <w:r>
-        <w:t xml:space="preserve">Moodley, S. &amp; Marks, M. 2023. 'Welbedacht is a beautiful place': community insights on placemaking and social transformation in a state resettlement programme in eThekwini, Durban, South Africa. </w:t>
+        <w:t>Moodley, S. &amp; Marks, M. 2023. '</w:t>
+      </w:r>
+      <w:proofErr w:type="spellStart"/>
+      <w:r>
+        <w:t>Welbedacht</w:t>
+      </w:r>
+      <w:proofErr w:type="spellEnd"/>
+      <w:r>
+        <w:t xml:space="preserve"> is a beautiful place': community insights on placemaking and social transformation in a state resettlement programme in eThekwini, Durban, South Africa. </w:t>
       </w:r>
       <w:r>
         <w:rPr>
@@ -2659,7 +3267,15 @@
         <w:t>Transformation: Critical Perspectives on Southern Africa.</w:t>
       </w:r>
       <w:r>
-        <w:t xml:space="preserve"> 112:119-149. DOI:10.1353/trn.2023.a926452.</w:t>
+        <w:t xml:space="preserve"> 112:119-149. DOI:10.1353/</w:t>
+      </w:r>
+      <w:proofErr w:type="gramStart"/>
+      <w:r>
+        <w:t>trn.2023.a</w:t>
+      </w:r>
+      <w:proofErr w:type="gramEnd"/>
+      <w:r>
+        <w:t>926452.</w:t>
       </w:r>
     </w:p>
     <w:p>
@@ -2685,7 +3301,23 @@
         <w:ind w:left="720" w:hanging="720"/>
       </w:pPr>
       <w:r>
-        <w:t xml:space="preserve">Ray, B. 2010. Residents of Joe Slovo community v Thubelisha Homes and others: the two faces of engagement. </w:t>
+        <w:t xml:space="preserve">Ray, B. 2010. Residents of Joe </w:t>
+      </w:r>
+      <w:proofErr w:type="spellStart"/>
+      <w:r>
+        <w:t>Slovo</w:t>
+      </w:r>
+      <w:proofErr w:type="spellEnd"/>
+      <w:r>
+        <w:t xml:space="preserve"> community v </w:t>
+      </w:r>
+      <w:proofErr w:type="spellStart"/>
+      <w:r>
+        <w:t>Thubelisha</w:t>
+      </w:r>
+      <w:proofErr w:type="spellEnd"/>
+      <w:r>
+        <w:t xml:space="preserve"> Homes and others: the two faces of engagement. </w:t>
       </w:r>
       <w:r>
         <w:rPr>
@@ -2695,7 +3327,15 @@
         <w:t>Human Rights Law Review.</w:t>
       </w:r>
       <w:r>
-        <w:t xml:space="preserve"> 10(2):360-371. DOI:10.1093/hrlr/ngq002.</w:t>
+        <w:t xml:space="preserve"> 10(2):360-371. DOI:10.1093/</w:t>
+      </w:r>
+      <w:proofErr w:type="spellStart"/>
+      <w:r>
+        <w:t>hrlr</w:t>
+      </w:r>
+      <w:proofErr w:type="spellEnd"/>
+      <w:r>
+        <w:t>/ngq002.</w:t>
       </w:r>
     </w:p>
     <w:p>
@@ -2744,7 +3384,23 @@
           <w:b/>
           <w:bCs/>
         </w:rPr>
-        <w:t xml:space="preserve">Verghese, B. &amp; Rawoot, I. 2021. Fighting dispossession. </w:t>
+        <w:t xml:space="preserve">Verghese, B. &amp; </w:t>
+      </w:r>
+      <w:proofErr w:type="spellStart"/>
+      <w:r>
+        <w:rPr>
+          <w:b/>
+          <w:bCs/>
+        </w:rPr>
+        <w:t>Rawoot</w:t>
+      </w:r>
+      <w:proofErr w:type="spellEnd"/>
+      <w:r>
+        <w:rPr>
+          <w:b/>
+          <w:bCs/>
+        </w:rPr>
+        <w:t xml:space="preserve">, I. 2021. Fighting dispossession. </w:t>
       </w:r>
       <w:r>
         <w:rPr>
@@ -2767,14 +3423,7 @@
           <w:b/>
           <w:bCs/>
         </w:rPr>
-        <w:t xml:space="preserve"> A</w:t>
-      </w:r>
-      <w:r>
-        <w:rPr>
-          <w:b/>
-          <w:bCs/>
-        </w:rPr>
-        <w:t xml:space="preserve">vailable: </w:t>
+        <w:t xml:space="preserve"> Available: </w:t>
       </w:r>
       <w:hyperlink r:id="rId10" w:history="1">
         <w:r>
@@ -2816,23 +3465,60 @@
         <w:t>City &amp; Community.</w:t>
       </w:r>
       <w:r>
-        <w:t xml:space="preserve"> 8(4):407-432. DOI:10.1111/j.1540-6040.2009.01300.x.</w:t>
-      </w:r>
-    </w:p>
-    <w:p>
-      <w:pPr>
-        <w:ind w:left="720" w:hanging="720"/>
-        <w:rPr>
-          <w:b/>
-          <w:bCs/>
-        </w:rPr>
-      </w:pPr>
-      <w:r>
-        <w:rPr>
-          <w:b/>
-          <w:bCs/>
-        </w:rPr>
-        <w:t xml:space="preserve">Williams, G., Charlton, S., Coelho, K., Mahadevia, D. &amp; Meth, P. 2022. (Im)mobility at the margins: low-income households' experiences of peripheral resettlement in India and South Africa. </w:t>
+        <w:t xml:space="preserve"> 8(4):407-432. DOI:10.1111/j.1540-6040.2009.</w:t>
+      </w:r>
+      <w:proofErr w:type="gramStart"/>
+      <w:r>
+        <w:t>01300.x.</w:t>
+      </w:r>
+      <w:proofErr w:type="gramEnd"/>
+    </w:p>
+    <w:p>
+      <w:pPr>
+        <w:ind w:left="720" w:hanging="720"/>
+        <w:rPr>
+          <w:b/>
+          <w:bCs/>
+        </w:rPr>
+      </w:pPr>
+      <w:r>
+        <w:rPr>
+          <w:b/>
+          <w:bCs/>
+        </w:rPr>
+        <w:t xml:space="preserve">Williams, G., Charlton, S., Coelho, K., </w:t>
+      </w:r>
+      <w:proofErr w:type="spellStart"/>
+      <w:r>
+        <w:rPr>
+          <w:b/>
+          <w:bCs/>
+        </w:rPr>
+        <w:t>Mahadevia</w:t>
+      </w:r>
+      <w:proofErr w:type="spellEnd"/>
+      <w:r>
+        <w:rPr>
+          <w:b/>
+          <w:bCs/>
+        </w:rPr>
+        <w:t>, D. &amp; Meth, P. 2022. (</w:t>
+      </w:r>
+      <w:proofErr w:type="spellStart"/>
+      <w:r>
+        <w:rPr>
+          <w:b/>
+          <w:bCs/>
+        </w:rPr>
+        <w:t>Im</w:t>
+      </w:r>
+      <w:proofErr w:type="spellEnd"/>
+      <w:r>
+        <w:rPr>
+          <w:b/>
+          <w:bCs/>
+        </w:rPr>
+        <w:t xml:space="preserve">)mobility at the margins: low-income households' experiences of peripheral resettlement in India and South Africa. </w:t>
       </w:r>
       <w:r>
         <w:rPr>
@@ -2912,7 +3598,15 @@
         <w:t>Transformation: Critical Perspectives on Southern Africa.</w:t>
       </w:r>
       <w:r>
-        <w:t xml:space="preserve"> 112:68-93. DOI:10.1353/trn.2023.a926450.</w:t>
+        <w:t xml:space="preserve"> 112:68-93. DOI:10.1353/</w:t>
+      </w:r>
+      <w:proofErr w:type="gramStart"/>
+      <w:r>
+        <w:t>trn.2023.a</w:t>
+      </w:r>
+      <w:proofErr w:type="gramEnd"/>
+      <w:r>
+        <w:t>926450.</w:t>
       </w:r>
     </w:p>
     <w:p>
@@ -2988,7 +3682,23 @@
         <w:ind w:left="720" w:hanging="720"/>
       </w:pPr>
       <w:r>
-        <w:t xml:space="preserve">Mabin, A. 2023. Public endeavour and shelter at Cradock/Kaladokhwe/Nxuba, Eastern Cape, South Africa. </w:t>
+        <w:t>Mabin, A. 2023. Public endeavour and shelter at Cradock/</w:t>
+      </w:r>
+      <w:proofErr w:type="spellStart"/>
+      <w:r>
+        <w:t>Kaladokhwe</w:t>
+      </w:r>
+      <w:proofErr w:type="spellEnd"/>
+      <w:r>
+        <w:t>/</w:t>
+      </w:r>
+      <w:proofErr w:type="spellStart"/>
+      <w:r>
+        <w:t>Nxuba</w:t>
+      </w:r>
+      <w:proofErr w:type="spellEnd"/>
+      <w:r>
+        <w:t xml:space="preserve">, Eastern Cape, South Africa. </w:t>
       </w:r>
       <w:r>
         <w:rPr>
@@ -2998,7 +3708,15 @@
         <w:t>Transformation: Critical Perspectives on Southern Africa.</w:t>
       </w:r>
       <w:r>
-        <w:t xml:space="preserve"> 112:193-222. DOI:10.1353/trn.2023.a926455.</w:t>
+        <w:t xml:space="preserve"> 112:193-222. DOI:10.1353/</w:t>
+      </w:r>
+      <w:proofErr w:type="gramStart"/>
+      <w:r>
+        <w:t>trn.2023.a</w:t>
+      </w:r>
+      <w:proofErr w:type="gramEnd"/>
+      <w:r>
+        <w:t>926455.</w:t>
       </w:r>
     </w:p>
     <w:p>
@@ -3016,22 +3734,111 @@
         <w:t>Transformation: Critical Perspectives on Southern Africa.</w:t>
       </w:r>
       <w:r>
-        <w:t xml:space="preserve"> 112:5-8. DOI:10.1353/trn.2023.a926447.</w:t>
-      </w:r>
-    </w:p>
-    <w:p>
-      <w:pPr>
-        <w:ind w:left="720" w:hanging="720"/>
-      </w:pPr>
-      <w:r>
-        <w:t xml:space="preserve">Marais, L., Awuzie, B., Cloete, J., Napier, M. &amp; Greyling, E. 2020. A tale of two markets: unequal access to private property in a South African city. </w:t>
-      </w:r>
-      <w:r>
-        <w:rPr>
-          <w:i/>
-          <w:iCs/>
-        </w:rPr>
-        <w:t>Tijdschrift voor Economische en Sociale Geografie (Journal of Economic &amp; Social Geography).</w:t>
+        <w:t xml:space="preserve"> 112:5-8. DOI:10.1353/</w:t>
+      </w:r>
+      <w:proofErr w:type="gramStart"/>
+      <w:r>
+        <w:t>trn.2023.a</w:t>
+      </w:r>
+      <w:proofErr w:type="gramEnd"/>
+      <w:r>
+        <w:t>926447.</w:t>
+      </w:r>
+    </w:p>
+    <w:p>
+      <w:pPr>
+        <w:ind w:left="720" w:hanging="720"/>
+      </w:pPr>
+      <w:r>
+        <w:t xml:space="preserve">Marais, L., </w:t>
+      </w:r>
+      <w:proofErr w:type="spellStart"/>
+      <w:r>
+        <w:t>Awuzie</w:t>
+      </w:r>
+      <w:proofErr w:type="spellEnd"/>
+      <w:r>
+        <w:t xml:space="preserve">, B., Cloete, J., Napier, M. &amp; Greyling, E. 2020. A tale of two markets: unequal access to private property in a South African city. </w:t>
+      </w:r>
+      <w:proofErr w:type="spellStart"/>
+      <w:r>
+        <w:rPr>
+          <w:i/>
+          <w:iCs/>
+        </w:rPr>
+        <w:t>Tijdschrift</w:t>
+      </w:r>
+      <w:proofErr w:type="spellEnd"/>
+      <w:r>
+        <w:rPr>
+          <w:i/>
+          <w:iCs/>
+        </w:rPr>
+        <w:t xml:space="preserve"> </w:t>
+      </w:r>
+      <w:proofErr w:type="spellStart"/>
+      <w:r>
+        <w:rPr>
+          <w:i/>
+          <w:iCs/>
+        </w:rPr>
+        <w:t>voor</w:t>
+      </w:r>
+      <w:proofErr w:type="spellEnd"/>
+      <w:r>
+        <w:rPr>
+          <w:i/>
+          <w:iCs/>
+        </w:rPr>
+        <w:t xml:space="preserve"> </w:t>
+      </w:r>
+      <w:proofErr w:type="spellStart"/>
+      <w:r>
+        <w:rPr>
+          <w:i/>
+          <w:iCs/>
+        </w:rPr>
+        <w:t>Economische</w:t>
+      </w:r>
+      <w:proofErr w:type="spellEnd"/>
+      <w:r>
+        <w:rPr>
+          <w:i/>
+          <w:iCs/>
+        </w:rPr>
+        <w:t xml:space="preserve"> </w:t>
+      </w:r>
+      <w:proofErr w:type="spellStart"/>
+      <w:r>
+        <w:rPr>
+          <w:i/>
+          <w:iCs/>
+        </w:rPr>
+        <w:t>en</w:t>
+      </w:r>
+      <w:proofErr w:type="spellEnd"/>
+      <w:r>
+        <w:rPr>
+          <w:i/>
+          <w:iCs/>
+        </w:rPr>
+        <w:t xml:space="preserve"> Sociale </w:t>
+      </w:r>
+      <w:proofErr w:type="spellStart"/>
+      <w:r>
+        <w:rPr>
+          <w:i/>
+          <w:iCs/>
+        </w:rPr>
+        <w:t>Geografie</w:t>
+      </w:r>
+      <w:proofErr w:type="spellEnd"/>
+      <w:r>
+        <w:rPr>
+          <w:i/>
+          <w:iCs/>
+        </w:rPr>
+        <w:t xml:space="preserve"> (Journal of Economic &amp; Social Geography).</w:t>
       </w:r>
       <w:r>
         <w:t xml:space="preserve"> 111(1):80-98. DOI:10.1111/tesg.12367.</w:t>
@@ -3041,9 +3848,22 @@
       <w:pPr>
         <w:ind w:left="720" w:hanging="720"/>
       </w:pPr>
+      <w:proofErr w:type="spellStart"/>
       <w:r>
         <w:lastRenderedPageBreak/>
-        <w:t xml:space="preserve">Matsha, R.M., Erwin, K. &amp; Musvot, G. 2023. The cost of ownership: learning from Flamingo Court, a former social housing apartment block in Durban. </w:t>
+        <w:t>Matsha</w:t>
+      </w:r>
+      <w:proofErr w:type="spellEnd"/>
+      <w:r>
+        <w:t xml:space="preserve">, R.M., Erwin, K. &amp; </w:t>
+      </w:r>
+      <w:proofErr w:type="spellStart"/>
+      <w:r>
+        <w:t>Musvot</w:t>
+      </w:r>
+      <w:proofErr w:type="spellEnd"/>
+      <w:r>
+        <w:t xml:space="preserve">, G. 2023. The cost of ownership: learning from Flamingo Court, a former social housing apartment block in Durban. </w:t>
       </w:r>
       <w:r>
         <w:rPr>
@@ -3053,7 +3873,15 @@
         <w:t>Transformation: Critical Perspectives on Southern Africa.</w:t>
       </w:r>
       <w:r>
-        <w:t xml:space="preserve"> 112:94-118. DOI:10.1353/trn.2023.a926451.</w:t>
+        <w:t xml:space="preserve"> 112:94-118. DOI:10.1353/</w:t>
+      </w:r>
+      <w:proofErr w:type="gramStart"/>
+      <w:r>
+        <w:t>trn.2023.a</w:t>
+      </w:r>
+      <w:proofErr w:type="gramEnd"/>
+      <w:r>
+        <w:t>926451.</w:t>
       </w:r>
     </w:p>
     <w:p>
@@ -3071,7 +3899,15 @@
         <w:t>Transformation: Critical Perspectives on Southern Africa.</w:t>
       </w:r>
       <w:r>
-        <w:t xml:space="preserve"> 112:150-163. DOI:10.1353/trn.2023.a926453.</w:t>
+        <w:t xml:space="preserve"> 112:150-163. DOI:10.1353/</w:t>
+      </w:r>
+      <w:proofErr w:type="gramStart"/>
+      <w:r>
+        <w:t>trn.2023.a</w:t>
+      </w:r>
+      <w:proofErr w:type="gramEnd"/>
+      <w:r>
+        <w:t>926453.</w:t>
       </w:r>
     </w:p>
     <w:p>
@@ -3103,7 +3939,23 @@
           <w:b/>
           <w:bCs/>
         </w:rPr>
-        <w:t xml:space="preserve"> 84:72-82. DOI:10.38140/trp.v84i.7971.</w:t>
+        <w:t xml:space="preserve"> 84:72-82. DOI:10.38140/</w:t>
+      </w:r>
+      <w:proofErr w:type="gramStart"/>
+      <w:r>
+        <w:rPr>
+          <w:b/>
+          <w:bCs/>
+        </w:rPr>
+        <w:t>trp.v</w:t>
+      </w:r>
+      <w:proofErr w:type="gramEnd"/>
+      <w:r>
+        <w:rPr>
+          <w:b/>
+          <w:bCs/>
+        </w:rPr>
+        <w:t>84i.7971.</w:t>
       </w:r>
     </w:p>
     <w:p>
@@ -3226,30 +4078,39 @@
           <w:b/>
           <w:bCs/>
         </w:rPr>
-        <w:t>https://brooklynworks.brooklaw.edu/bjil/vol40/iss2/8</w:t>
-      </w:r>
-      <w:r>
-        <w:rPr>
-          <w:b/>
-          <w:bCs/>
-        </w:rPr>
-        <w:t>.</w:t>
-      </w:r>
-    </w:p>
-    <w:p>
-      <w:pPr>
-        <w:ind w:left="720" w:hanging="720"/>
-        <w:rPr>
-          <w:b/>
-          <w:bCs/>
-        </w:rPr>
-      </w:pPr>
-      <w:r>
-        <w:rPr>
-          <w:b/>
-          <w:bCs/>
-        </w:rPr>
-        <w:t xml:space="preserve">Zulu, N., Maphosa, N. &amp; Sobantu, M. 2019. Housing as a basic human right: a reflection on South Africa. </w:t>
+        <w:t>https://brooklynworks.brooklaw.edu/bjil/vol40/iss2/8.</w:t>
+      </w:r>
+    </w:p>
+    <w:p>
+      <w:pPr>
+        <w:ind w:left="720" w:hanging="720"/>
+        <w:rPr>
+          <w:b/>
+          <w:bCs/>
+        </w:rPr>
+      </w:pPr>
+      <w:r>
+        <w:rPr>
+          <w:b/>
+          <w:bCs/>
+        </w:rPr>
+        <w:t xml:space="preserve">Zulu, N., Maphosa, N. &amp; </w:t>
+      </w:r>
+      <w:proofErr w:type="spellStart"/>
+      <w:r>
+        <w:rPr>
+          <w:b/>
+          <w:bCs/>
+        </w:rPr>
+        <w:t>Sobantu</w:t>
+      </w:r>
+      <w:proofErr w:type="spellEnd"/>
+      <w:r>
+        <w:rPr>
+          <w:b/>
+          <w:bCs/>
+        </w:rPr>
+        <w:t xml:space="preserve">, M. 2019. Housing as a basic human right: a reflection on South Africa. </w:t>
       </w:r>
       <w:r>
         <w:rPr>
@@ -3327,7 +4188,23 @@
         <w:ind w:left="720" w:hanging="720"/>
       </w:pPr>
       <w:r>
-        <w:t xml:space="preserve">Del Mistro, R. &amp; A. Hensher, D. 2009. Upgrading informal settlements in South Africa: policy, rhetoric and what residents really value. </w:t>
+        <w:t xml:space="preserve">Del </w:t>
+      </w:r>
+      <w:proofErr w:type="spellStart"/>
+      <w:r>
+        <w:t>Mistro</w:t>
+      </w:r>
+      <w:proofErr w:type="spellEnd"/>
+      <w:r>
+        <w:t xml:space="preserve">, R. &amp; A. </w:t>
+      </w:r>
+      <w:proofErr w:type="spellStart"/>
+      <w:r>
+        <w:t>Hensher</w:t>
+      </w:r>
+      <w:proofErr w:type="spellEnd"/>
+      <w:r>
+        <w:t xml:space="preserve">, D. 2009. Upgrading informal settlements in South Africa: policy, rhetoric and what residents really value. </w:t>
       </w:r>
       <w:r>
         <w:rPr>
@@ -3345,7 +4222,23 @@
         <w:ind w:left="720" w:hanging="720"/>
       </w:pPr>
       <w:r>
-        <w:t xml:space="preserve">Grazioli, M. 2023. Eurhythmisation and organisational rites of housing squats in rome. </w:t>
+        <w:t xml:space="preserve">Grazioli, M. 2023. </w:t>
+      </w:r>
+      <w:proofErr w:type="spellStart"/>
+      <w:r>
+        <w:t>Eurhythmisation</w:t>
+      </w:r>
+      <w:proofErr w:type="spellEnd"/>
+      <w:r>
+        <w:t xml:space="preserve"> and organisational rites of housing squats in </w:t>
+      </w:r>
+      <w:proofErr w:type="spellStart"/>
+      <w:r>
+        <w:t>rome</w:t>
+      </w:r>
+      <w:proofErr w:type="spellEnd"/>
+      <w:r>
+        <w:t xml:space="preserve">. </w:t>
       </w:r>
       <w:r>
         <w:rPr>
@@ -3374,7 +4267,15 @@
         <w:t>Habitat International.</w:t>
       </w:r>
       <w:r>
-        <w:t xml:space="preserve"> 33(4):472-484. DOI:10.1016/j.habitatint.2009.03.002.</w:t>
+        <w:t xml:space="preserve"> 33(4):472-484. </w:t>
+      </w:r>
+      <w:proofErr w:type="gramStart"/>
+      <w:r>
+        <w:t>DOI:10.1016/j.habitatint</w:t>
+      </w:r>
+      <w:proofErr w:type="gramEnd"/>
+      <w:r>
+        <w:t>.2009.03.002.</w:t>
       </w:r>
     </w:p>
     <w:p>
@@ -4271,6 +5172,7 @@
   <w:style w:type="character" w:default="1" w:styleId="DefaultParagraphFont">
     <w:name w:val="Default Paragraph Font"/>
     <w:uiPriority w:val="1"/>
+    <w:semiHidden/>
     <w:unhideWhenUsed/>
   </w:style>
   <w:style w:type="table" w:default="1" w:styleId="TableNormal">
@@ -4694,6 +5596,18 @@
       <w:ind w:left="220"/>
     </w:pPr>
   </w:style>
+  <w:style w:type="character" w:styleId="FollowedHyperlink">
+    <w:name w:val="FollowedHyperlink"/>
+    <w:basedOn w:val="DefaultParagraphFont"/>
+    <w:uiPriority w:val="99"/>
+    <w:semiHidden/>
+    <w:unhideWhenUsed/>
+    <w:rsid w:val="00BA46F6"/>
+    <w:rPr>
+      <w:color w:val="800080" w:themeColor="followedHyperlink"/>
+      <w:u w:val="single"/>
+    </w:rPr>
+  </w:style>
 </w:styles>
 </file>
 

</xml_diff>